<commit_message>
Update generate_product_doc.py: phases current, 211 tests, 2-tab dashboard, Q1/Q2 done
Co-Authored-By: Claude Sonnet 4.6 <noreply@anthropic.com>
</commit_message>
<xml_diff>
--- a/design/AI_Agent_RCA_Product_Design.docx
+++ b/design/AI_Agent_RCA_Product_Design.docx
@@ -6936,7 +6936,7 @@
       <w:tr>
         <w:tc>
           <w:tcPr>
-            <w:tcW w:type="dxa" w:w="864"/>
+            <w:tcW w:type="dxa" w:w="1584"/>
             <w:shd w:val="clear" w:color="auto" w:fill="1e3a5f"/>
           </w:tcPr>
           <w:p>
@@ -6956,7 +6956,7 @@
         </w:tc>
         <w:tc>
           <w:tcPr>
-            <w:tcW w:type="dxa" w:w="7776"/>
+            <w:tcW w:type="dxa" w:w="7056"/>
             <w:shd w:val="clear" w:color="auto" w:fill="1e3a5f"/>
           </w:tcPr>
           <w:p>
@@ -6998,7 +6998,7 @@
       <w:tr>
         <w:tc>
           <w:tcPr>
-            <w:tcW w:type="dxa" w:w="864"/>
+            <w:tcW w:type="dxa" w:w="1584"/>
             <w:shd w:val="clear" w:color="auto" w:fill="F8FAFC"/>
           </w:tcPr>
           <w:p>
@@ -7018,7 +7018,7 @@
         </w:tc>
         <w:tc>
           <w:tcPr>
-            <w:tcW w:type="dxa" w:w="7776"/>
+            <w:tcW w:type="dxa" w:w="7056"/>
             <w:shd w:val="clear" w:color="auto" w:fill="F8FAFC"/>
           </w:tcPr>
           <w:p>
@@ -7060,7 +7060,7 @@
       <w:tr>
         <w:tc>
           <w:tcPr>
-            <w:tcW w:type="dxa" w:w="864"/>
+            <w:tcW w:type="dxa" w:w="1584"/>
             <w:shd w:val="clear" w:color="auto" w:fill="FFFFFF"/>
           </w:tcPr>
           <w:p>
@@ -7080,7 +7080,7 @@
         </w:tc>
         <w:tc>
           <w:tcPr>
-            <w:tcW w:type="dxa" w:w="7776"/>
+            <w:tcW w:type="dxa" w:w="7056"/>
             <w:shd w:val="clear" w:color="auto" w:fill="FFFFFF"/>
           </w:tcPr>
           <w:p>
@@ -7122,7 +7122,7 @@
       <w:tr>
         <w:tc>
           <w:tcPr>
-            <w:tcW w:type="dxa" w:w="864"/>
+            <w:tcW w:type="dxa" w:w="1584"/>
             <w:shd w:val="clear" w:color="auto" w:fill="F8FAFC"/>
           </w:tcPr>
           <w:p>
@@ -7142,7 +7142,7 @@
         </w:tc>
         <w:tc>
           <w:tcPr>
-            <w:tcW w:type="dxa" w:w="7776"/>
+            <w:tcW w:type="dxa" w:w="7056"/>
             <w:shd w:val="clear" w:color="auto" w:fill="F8FAFC"/>
           </w:tcPr>
           <w:p>
@@ -7156,7 +7156,7 @@
                 <w:color w:val="0F172A"/>
                 <w:sz w:val="18"/>
               </w:rPr>
-              <w:t>Dashboard: 6 pages, Quality Drift 3-tab, business evals, auth gate, LLM summaries</w:t>
+              <w:t>Dashboard: 6 pages, Quality Drift 2-tab (Operational/Business + Semantic Health), business evals, auth gate, LLM summaries</w:t>
             </w:r>
           </w:p>
         </w:tc>
@@ -7177,6 +7177,378 @@
                 <w:sz w:val="18"/>
               </w:rPr>
               <w:t>2026-05-31</w:t>
+            </w:r>
+          </w:p>
+        </w:tc>
+      </w:tr>
+      <w:tr>
+        <w:tc>
+          <w:tcPr>
+            <w:tcW w:type="dxa" w:w="1584"/>
+            <w:shd w:val="clear" w:color="auto" w:fill="FFFFFF"/>
+          </w:tcPr>
+          <w:p>
+            <w:pPr>
+              <w:spacing w:after="40"/>
+            </w:pPr>
+            <w:r>
+              <w:rPr>
+                <w:b w:val="0"/>
+                <w:i w:val="0"/>
+                <w:color w:val="0F172A"/>
+                <w:sz w:val="18"/>
+              </w:rPr>
+              <w:t>4b-patterns</w:t>
+            </w:r>
+          </w:p>
+        </w:tc>
+        <w:tc>
+          <w:tcPr>
+            <w:tcW w:type="dxa" w:w="7056"/>
+            <w:shd w:val="clear" w:color="auto" w:fill="FFFFFF"/>
+          </w:tcPr>
+          <w:p>
+            <w:pPr>
+              <w:spacing w:after="40"/>
+            </w:pPr>
+            <w:r>
+              <w:rPr>
+                <w:b w:val="0"/>
+                <w:i w:val="0"/>
+                <w:color w:val="0F172A"/>
+                <w:sz w:val="18"/>
+              </w:rPr>
+              <w:t>4 new operational patterns (Hyperactive Polling, Tool Fabrication, Handoff Schema Break, Error Misinterpretation)</w:t>
+            </w:r>
+          </w:p>
+        </w:tc>
+        <w:tc>
+          <w:tcPr>
+            <w:tcW w:type="dxa" w:w="1728"/>
+            <w:shd w:val="clear" w:color="auto" w:fill="FFFFFF"/>
+          </w:tcPr>
+          <w:p>
+            <w:pPr>
+              <w:spacing w:after="40"/>
+            </w:pPr>
+            <w:r>
+              <w:rPr>
+                <w:b w:val="0"/>
+                <w:i w:val="0"/>
+                <w:color w:val="0F172A"/>
+                <w:sz w:val="18"/>
+              </w:rPr>
+              <w:t>2026-06-01</w:t>
+            </w:r>
+          </w:p>
+        </w:tc>
+      </w:tr>
+      <w:tr>
+        <w:tc>
+          <w:tcPr>
+            <w:tcW w:type="dxa" w:w="1584"/>
+            <w:shd w:val="clear" w:color="auto" w:fill="F8FAFC"/>
+          </w:tcPr>
+          <w:p>
+            <w:pPr>
+              <w:spacing w:after="40"/>
+            </w:pPr>
+            <w:r>
+              <w:rPr>
+                <w:b w:val="0"/>
+                <w:i w:val="0"/>
+                <w:color w:val="0F172A"/>
+                <w:sz w:val="18"/>
+              </w:rPr>
+              <w:t>4b-realtime</w:t>
+            </w:r>
+          </w:p>
+        </w:tc>
+        <w:tc>
+          <w:tcPr>
+            <w:tcW w:type="dxa" w:w="7056"/>
+            <w:shd w:val="clear" w:color="auto" w:fill="F8FAFC"/>
+          </w:tcPr>
+          <w:p>
+            <w:pPr>
+              <w:spacing w:after="40"/>
+            </w:pPr>
+            <w:r>
+              <w:rPr>
+                <w:b w:val="0"/>
+                <w:i w:val="0"/>
+                <w:color w:val="0F172A"/>
+                <w:sz w:val="18"/>
+              </w:rPr>
+              <w:t>Supabase Realtime monitor + polling fallback + shadow CB persistence</w:t>
+            </w:r>
+          </w:p>
+        </w:tc>
+        <w:tc>
+          <w:tcPr>
+            <w:tcW w:type="dxa" w:w="1728"/>
+            <w:shd w:val="clear" w:color="auto" w:fill="F8FAFC"/>
+          </w:tcPr>
+          <w:p>
+            <w:pPr>
+              <w:spacing w:after="40"/>
+            </w:pPr>
+            <w:r>
+              <w:rPr>
+                <w:b w:val="0"/>
+                <w:i w:val="0"/>
+                <w:color w:val="0F172A"/>
+                <w:sz w:val="18"/>
+              </w:rPr>
+              <w:t>2026-06-01</w:t>
+            </w:r>
+          </w:p>
+        </w:tc>
+      </w:tr>
+      <w:tr>
+        <w:tc>
+          <w:tcPr>
+            <w:tcW w:type="dxa" w:w="1584"/>
+            <w:shd w:val="clear" w:color="auto" w:fill="FFFFFF"/>
+          </w:tcPr>
+          <w:p>
+            <w:pPr>
+              <w:spacing w:after="40"/>
+            </w:pPr>
+            <w:r>
+              <w:rPr>
+                <w:b w:val="0"/>
+                <w:i w:val="0"/>
+                <w:color w:val="0F172A"/>
+                <w:sz w:val="18"/>
+              </w:rPr>
+              <w:t>4b-tool-tracer</w:t>
+            </w:r>
+          </w:p>
+        </w:tc>
+        <w:tc>
+          <w:tcPr>
+            <w:tcW w:type="dxa" w:w="7056"/>
+            <w:shd w:val="clear" w:color="auto" w:fill="FFFFFF"/>
+          </w:tcPr>
+          <w:p>
+            <w:pPr>
+              <w:spacing w:after="40"/>
+            </w:pPr>
+            <w:r>
+              <w:rPr>
+                <w:b w:val="0"/>
+                <w:i w:val="0"/>
+                <w:color w:val="0F172A"/>
+                <w:sz w:val="18"/>
+              </w:rPr>
+              <w:t>Tool-level cost tracer SDK: @trace_tool, ToolSpan, c_tool_spans</w:t>
+            </w:r>
+          </w:p>
+        </w:tc>
+        <w:tc>
+          <w:tcPr>
+            <w:tcW w:type="dxa" w:w="1728"/>
+            <w:shd w:val="clear" w:color="auto" w:fill="FFFFFF"/>
+          </w:tcPr>
+          <w:p>
+            <w:pPr>
+              <w:spacing w:after="40"/>
+            </w:pPr>
+            <w:r>
+              <w:rPr>
+                <w:b w:val="0"/>
+                <w:i w:val="0"/>
+                <w:color w:val="0F172A"/>
+                <w:sz w:val="18"/>
+              </w:rPr>
+              <w:t>2026-06-01</w:t>
+            </w:r>
+          </w:p>
+        </w:tc>
+      </w:tr>
+      <w:tr>
+        <w:tc>
+          <w:tcPr>
+            <w:tcW w:type="dxa" w:w="1584"/>
+            <w:shd w:val="clear" w:color="auto" w:fill="F8FAFC"/>
+          </w:tcPr>
+          <w:p>
+            <w:pPr>
+              <w:spacing w:after="40"/>
+            </w:pPr>
+            <w:r>
+              <w:rPr>
+                <w:b w:val="0"/>
+                <w:i w:val="0"/>
+                <w:color w:val="0F172A"/>
+                <w:sz w:val="18"/>
+              </w:rPr>
+              <w:t>D1</w:t>
+            </w:r>
+          </w:p>
+        </w:tc>
+        <w:tc>
+          <w:tcPr>
+            <w:tcW w:type="dxa" w:w="7056"/>
+            <w:shd w:val="clear" w:color="auto" w:fill="F8FAFC"/>
+          </w:tcPr>
+          <w:p>
+            <w:pPr>
+              <w:spacing w:after="40"/>
+            </w:pPr>
+            <w:r>
+              <w:rPr>
+                <w:b w:val="0"/>
+                <w:i w:val="0"/>
+                <w:color w:val="0F172A"/>
+                <w:sz w:val="18"/>
+              </w:rPr>
+              <w:t>Isolation Forest anomaly detector — 3 real anomalies detected (May 28 yfinance hang)</w:t>
+            </w:r>
+          </w:p>
+        </w:tc>
+        <w:tc>
+          <w:tcPr>
+            <w:tcW w:type="dxa" w:w="1728"/>
+            <w:shd w:val="clear" w:color="auto" w:fill="F8FAFC"/>
+          </w:tcPr>
+          <w:p>
+            <w:pPr>
+              <w:spacing w:after="40"/>
+            </w:pPr>
+            <w:r>
+              <w:rPr>
+                <w:b w:val="0"/>
+                <w:i w:val="0"/>
+                <w:color w:val="0F172A"/>
+                <w:sz w:val="18"/>
+              </w:rPr>
+              <w:t>2026-06-01</w:t>
+            </w:r>
+          </w:p>
+        </w:tc>
+      </w:tr>
+      <w:tr>
+        <w:tc>
+          <w:tcPr>
+            <w:tcW w:type="dxa" w:w="1584"/>
+            <w:shd w:val="clear" w:color="auto" w:fill="FFFFFF"/>
+          </w:tcPr>
+          <w:p>
+            <w:pPr>
+              <w:spacing w:after="40"/>
+            </w:pPr>
+            <w:r>
+              <w:rPr>
+                <w:b w:val="0"/>
+                <w:i w:val="0"/>
+                <w:color w:val="0F172A"/>
+                <w:sz w:val="18"/>
+              </w:rPr>
+              <w:t>Q1</w:t>
+            </w:r>
+          </w:p>
+        </w:tc>
+        <w:tc>
+          <w:tcPr>
+            <w:tcW w:type="dxa" w:w="7056"/>
+            <w:shd w:val="clear" w:color="auto" w:fill="FFFFFF"/>
+          </w:tcPr>
+          <w:p>
+            <w:pPr>
+              <w:spacing w:after="40"/>
+            </w:pPr>
+            <w:r>
+              <w:rPr>
+                <w:b w:val="0"/>
+                <w:i w:val="0"/>
+                <w:color w:val="0F172A"/>
+                <w:sz w:val="18"/>
+              </w:rPr>
+              <w:t>quality_judge.py: 20 dimensions, 4 composites, structural proxy scoring, 41 tests</w:t>
+            </w:r>
+          </w:p>
+        </w:tc>
+        <w:tc>
+          <w:tcPr>
+            <w:tcW w:type="dxa" w:w="1728"/>
+            <w:shd w:val="clear" w:color="auto" w:fill="FFFFFF"/>
+          </w:tcPr>
+          <w:p>
+            <w:pPr>
+              <w:spacing w:after="40"/>
+            </w:pPr>
+            <w:r>
+              <w:rPr>
+                <w:b w:val="0"/>
+                <w:i w:val="0"/>
+                <w:color w:val="0F172A"/>
+                <w:sz w:val="18"/>
+              </w:rPr>
+              <w:t>2026-06-01</w:t>
+            </w:r>
+          </w:p>
+        </w:tc>
+      </w:tr>
+      <w:tr>
+        <w:tc>
+          <w:tcPr>
+            <w:tcW w:type="dxa" w:w="1584"/>
+            <w:shd w:val="clear" w:color="auto" w:fill="F8FAFC"/>
+          </w:tcPr>
+          <w:p>
+            <w:pPr>
+              <w:spacing w:after="40"/>
+            </w:pPr>
+            <w:r>
+              <w:rPr>
+                <w:b w:val="0"/>
+                <w:i w:val="0"/>
+                <w:color w:val="0F172A"/>
+                <w:sz w:val="18"/>
+              </w:rPr>
+              <w:t>Q2</w:t>
+            </w:r>
+          </w:p>
+        </w:tc>
+        <w:tc>
+          <w:tcPr>
+            <w:tcW w:type="dxa" w:w="7056"/>
+            <w:shd w:val="clear" w:color="auto" w:fill="F8FAFC"/>
+          </w:tcPr>
+          <w:p>
+            <w:pPr>
+              <w:spacing w:after="40"/>
+            </w:pPr>
+            <w:r>
+              <w:rPr>
+                <w:b w:val="0"/>
+                <w:i w:val="0"/>
+                <w:color w:val="0F172A"/>
+                <w:sz w:val="18"/>
+              </w:rPr>
+              <w:t>Semantic Health tab: drift cards, system composite + agent small multiples, dimension breakdown with inline fix/gap popovers</w:t>
+            </w:r>
+          </w:p>
+        </w:tc>
+        <w:tc>
+          <w:tcPr>
+            <w:tcW w:type="dxa" w:w="1728"/>
+            <w:shd w:val="clear" w:color="auto" w:fill="F8FAFC"/>
+          </w:tcPr>
+          <w:p>
+            <w:pPr>
+              <w:spacing w:after="40"/>
+            </w:pPr>
+            <w:r>
+              <w:rPr>
+                <w:b w:val="0"/>
+                <w:i w:val="0"/>
+                <w:color w:val="0F172A"/>
+                <w:sz w:val="18"/>
+              </w:rPr>
+              <w:t>2026-06-02</w:t>
             </w:r>
           </w:p>
         </w:tc>
@@ -7186,6 +7558,20 @@
       <w:pPr>
         <w:spacing w:after="40"/>
       </w:pPr>
+    </w:p>
+    <w:p>
+      <w:pPr>
+        <w:spacing w:after="80"/>
+      </w:pPr>
+      <w:r>
+        <w:rPr>
+          <w:b w:val="0"/>
+          <w:i w:val="0"/>
+          <w:color w:val="0F172A"/>
+          <w:sz w:val="20"/>
+        </w:rPr>
+        <w:t>211 tests passing. 36 sessions scored. 684 quality evals backfilled.</w:t>
+      </w:r>
     </w:p>
     <w:p>
       <w:pPr>
@@ -7198,7 +7584,7 @@
           <w:color w:val="1E40AF"/>
           <w:sz w:val="26"/>
         </w:rPr>
-        <w:t>Quality Layer</w:t>
+        <w:t>Pending</w:t>
       </w:r>
     </w:p>
     <w:tbl>
@@ -7217,7 +7603,7 @@
       <w:tr>
         <w:tc>
           <w:tcPr>
-            <w:tcW w:type="dxa" w:w="720"/>
+            <w:tcW w:type="dxa" w:w="1008"/>
             <w:shd w:val="clear" w:color="auto" w:fill="1e3a5f"/>
           </w:tcPr>
           <w:p>
@@ -7237,7 +7623,7 @@
         </w:tc>
         <w:tc>
           <w:tcPr>
-            <w:tcW w:type="dxa" w:w="5472"/>
+            <w:tcW w:type="dxa" w:w="5040"/>
             <w:shd w:val="clear" w:color="auto" w:fill="1e3a5f"/>
           </w:tcPr>
           <w:p>
@@ -7271,13 +7657,13 @@
                 <w:color w:val="FFFFFF"/>
                 <w:sz w:val="18"/>
               </w:rPr>
-              <w:t>Effort</w:t>
-            </w:r>
-          </w:p>
-        </w:tc>
-        <w:tc>
-          <w:tcPr>
-            <w:tcW w:type="dxa" w:w="2736"/>
+              <w:t>Status</w:t>
+            </w:r>
+          </w:p>
+        </w:tc>
+        <w:tc>
+          <w:tcPr>
+            <w:tcW w:type="dxa" w:w="3024"/>
             <w:shd w:val="clear" w:color="auto" w:fill="1e3a5f"/>
           </w:tcPr>
           <w:p>
@@ -7299,7 +7685,7 @@
       <w:tr>
         <w:tc>
           <w:tcPr>
-            <w:tcW w:type="dxa" w:w="720"/>
+            <w:tcW w:type="dxa" w:w="1008"/>
             <w:shd w:val="clear" w:color="auto" w:fill="F8FAFC"/>
           </w:tcPr>
           <w:p>
@@ -7313,13 +7699,13 @@
                 <w:color w:val="0F172A"/>
                 <w:sz w:val="18"/>
               </w:rPr>
-              <w:t>Q1</w:t>
-            </w:r>
-          </w:p>
-        </w:tc>
-        <w:tc>
-          <w:tcPr>
-            <w:tcW w:type="dxa" w:w="5472"/>
+              <w:t>Q3</w:t>
+            </w:r>
+          </w:p>
+        </w:tc>
+        <w:tc>
+          <w:tcPr>
+            <w:tcW w:type="dxa" w:w="5040"/>
             <w:shd w:val="clear" w:color="auto" w:fill="F8FAFC"/>
           </w:tcPr>
           <w:p>
@@ -7333,7 +7719,7 @@
                 <w:color w:val="0F172A"/>
                 <w:sz w:val="18"/>
               </w:rPr>
-              <w:t>engine/quality_judge.py — Haiku batch eval, prompt construction, JSON parsing, c_evals storage. scripts/backfill_quality.py. Tests.</w:t>
+              <w:t>Quality patterns: Grounding Failure, Coherence Break, Quality Cascade, Silent Degradation</w:t>
             </w:r>
           </w:p>
         </w:tc>
@@ -7353,13 +7739,13 @@
                 <w:color w:val="0F172A"/>
                 <w:sz w:val="18"/>
               </w:rPr>
-              <w:t>2-3 days</w:t>
-            </w:r>
-          </w:p>
-        </w:tc>
-        <w:tc>
-          <w:tcPr>
-            <w:tcW w:type="dxa" w:w="2736"/>
+              <w:t>Not started</w:t>
+            </w:r>
+          </w:p>
+        </w:tc>
+        <w:tc>
+          <w:tcPr>
+            <w:tcW w:type="dxa" w:w="3024"/>
             <w:shd w:val="clear" w:color="auto" w:fill="F8FAFC"/>
           </w:tcPr>
           <w:p>
@@ -7373,7 +7759,7 @@
                 <w:color w:val="0F172A"/>
                 <w:sz w:val="18"/>
               </w:rPr>
-              <w:t>Manual review of 10 sessions</w:t>
+              <w:t>Q2 done</w:t>
             </w:r>
           </w:p>
         </w:tc>
@@ -7381,7 +7767,7 @@
       <w:tr>
         <w:tc>
           <w:tcPr>
-            <w:tcW w:type="dxa" w:w="720"/>
+            <w:tcW w:type="dxa" w:w="1008"/>
             <w:shd w:val="clear" w:color="auto" w:fill="FFFFFF"/>
           </w:tcPr>
           <w:p>
@@ -7395,13 +7781,13 @@
                 <w:color w:val="0F172A"/>
                 <w:sz w:val="18"/>
               </w:rPr>
-              <w:t>Q2</w:t>
-            </w:r>
-          </w:p>
-        </w:tc>
-        <w:tc>
-          <w:tcPr>
-            <w:tcW w:type="dxa" w:w="5472"/>
+              <w:t>Q4</w:t>
+            </w:r>
+          </w:p>
+        </w:tc>
+        <w:tc>
+          <w:tcPr>
+            <w:tcW w:type="dxa" w:w="5040"/>
             <w:shd w:val="clear" w:color="auto" w:fill="FFFFFF"/>
           </w:tcPr>
           <w:p>
@@ -7415,7 +7801,7 @@
                 <w:color w:val="0F172A"/>
                 <w:sz w:val="18"/>
               </w:rPr>
-              <w:t>Quality tab in Quality Drift. Per-agent trend charts. Recommendations panel. Quality scores in session detail.</w:t>
+              <w:t>Shadow quality CBs: would_trigger_cb flag, CB config, dashboard CB markers + cost-saved estimates</w:t>
             </w:r>
           </w:p>
         </w:tc>
@@ -7435,13 +7821,13 @@
                 <w:color w:val="0F172A"/>
                 <w:sz w:val="18"/>
               </w:rPr>
-              <w:t>2-3 days</w:t>
-            </w:r>
-          </w:p>
-        </w:tc>
-        <w:tc>
-          <w:tcPr>
-            <w:tcW w:type="dxa" w:w="2736"/>
+              <w:t>Not started</w:t>
+            </w:r>
+          </w:p>
+        </w:tc>
+        <w:tc>
+          <w:tcPr>
+            <w:tcW w:type="dxa" w:w="3024"/>
             <w:shd w:val="clear" w:color="auto" w:fill="FFFFFF"/>
           </w:tcPr>
           <w:p>
@@ -7455,7 +7841,7 @@
                 <w:color w:val="0F172A"/>
                 <w:sz w:val="18"/>
               </w:rPr>
-              <w:t>Q1 done</w:t>
+              <w:t>Q3 done</w:t>
             </w:r>
           </w:p>
         </w:tc>
@@ -7463,7 +7849,7 @@
       <w:tr>
         <w:tc>
           <w:tcPr>
-            <w:tcW w:type="dxa" w:w="720"/>
+            <w:tcW w:type="dxa" w:w="1008"/>
             <w:shd w:val="clear" w:color="auto" w:fill="F8FAFC"/>
           </w:tcPr>
           <w:p>
@@ -7477,13 +7863,13 @@
                 <w:color w:val="0F172A"/>
                 <w:sz w:val="18"/>
               </w:rPr>
-              <w:t>Q3</w:t>
-            </w:r>
-          </w:p>
-        </w:tc>
-        <w:tc>
-          <w:tcPr>
-            <w:tcW w:type="dxa" w:w="5472"/>
+              <w:t>4a</w:t>
+            </w:r>
+          </w:p>
+        </w:tc>
+        <w:tc>
+          <w:tcPr>
+            <w:tcW w:type="dxa" w:w="5040"/>
             <w:shd w:val="clear" w:color="auto" w:fill="F8FAFC"/>
           </w:tcPr>
           <w:p>
@@ -7497,7 +7883,7 @@
                 <w:color w:val="0F172A"/>
                 <w:sz w:val="18"/>
               </w:rPr>
-              <w:t>4 new quality patterns in pattern_detector.py. Drift detection rules. Tests.</w:t>
+              <w:t>In-process operational CBs in trading-agent-c (shadow, in-memory, ~0.5ms)</w:t>
             </w:r>
           </w:p>
         </w:tc>
@@ -7517,13 +7903,13 @@
                 <w:color w:val="0F172A"/>
                 <w:sz w:val="18"/>
               </w:rPr>
-              <w:t>1-2 days</w:t>
-            </w:r>
-          </w:p>
-        </w:tc>
-        <w:tc>
-          <w:tcPr>
-            <w:tcW w:type="dxa" w:w="2736"/>
+              <w:t>Not started</w:t>
+            </w:r>
+          </w:p>
+        </w:tc>
+        <w:tc>
+          <w:tcPr>
+            <w:tcW w:type="dxa" w:w="3024"/>
             <w:shd w:val="clear" w:color="auto" w:fill="F8FAFC"/>
           </w:tcPr>
           <w:p>
@@ -7537,7 +7923,7 @@
                 <w:color w:val="0F172A"/>
                 <w:sz w:val="18"/>
               </w:rPr>
-              <w:t>Q2 done</w:t>
+              <w:t>Q4 done</w:t>
             </w:r>
           </w:p>
         </w:tc>
@@ -7545,7 +7931,7 @@
       <w:tr>
         <w:tc>
           <w:tcPr>
-            <w:tcW w:type="dxa" w:w="720"/>
+            <w:tcW w:type="dxa" w:w="1008"/>
             <w:shd w:val="clear" w:color="auto" w:fill="FFFFFF"/>
           </w:tcPr>
           <w:p>
@@ -7559,13 +7945,13 @@
                 <w:color w:val="0F172A"/>
                 <w:sz w:val="18"/>
               </w:rPr>
-              <w:t>Q4</w:t>
-            </w:r>
-          </w:p>
-        </w:tc>
-        <w:tc>
-          <w:tcPr>
-            <w:tcW w:type="dxa" w:w="5472"/>
+              <w:t>4c</w:t>
+            </w:r>
+          </w:p>
+        </w:tc>
+        <w:tc>
+          <w:tcPr>
+            <w:tcW w:type="dxa" w:w="5040"/>
             <w:shd w:val="clear" w:color="auto" w:fill="FFFFFF"/>
           </w:tcPr>
           <w:p>
@@ -7579,7 +7965,7 @@
                 <w:color w:val="0F172A"/>
                 <w:sz w:val="18"/>
               </w:rPr>
-              <w:t>Shadow quality CBs. would_trigger_cb flag. CB config. Dashboard CB markers + cost-saved estimates.</w:t>
+              <w:t>Flip CBs to real mode — ops first, quality after validation</w:t>
             </w:r>
           </w:p>
         </w:tc>
@@ -7599,13 +7985,13 @@
                 <w:color w:val="0F172A"/>
                 <w:sz w:val="18"/>
               </w:rPr>
-              <w:t>1-2 days</w:t>
-            </w:r>
-          </w:p>
-        </w:tc>
-        <w:tc>
-          <w:tcPr>
-            <w:tcW w:type="dxa" w:w="2736"/>
+              <w:t>Blocked</w:t>
+            </w:r>
+          </w:p>
+        </w:tc>
+        <w:tc>
+          <w:tcPr>
+            <w:tcW w:type="dxa" w:w="3024"/>
             <w:shd w:val="clear" w:color="auto" w:fill="FFFFFF"/>
           </w:tcPr>
           <w:p>
@@ -7619,122 +8005,7 @@
                 <w:color w:val="0F172A"/>
                 <w:sz w:val="18"/>
               </w:rPr>
-              <w:t>Q3 done</w:t>
-            </w:r>
-          </w:p>
-        </w:tc>
-      </w:tr>
-    </w:tbl>
-    <w:p>
-      <w:pPr>
-        <w:spacing w:after="40"/>
-      </w:pPr>
-    </w:p>
-    <w:p>
-      <w:pPr>
-        <w:spacing w:before="280" w:after="80"/>
-      </w:pPr>
-      <w:r>
-        <w:rPr>
-          <w:b/>
-          <w:i w:val="0"/>
-          <w:color w:val="1E40AF"/>
-          <w:sz w:val="26"/>
-        </w:rPr>
-        <w:t>Real-time</w:t>
-      </w:r>
-    </w:p>
-    <w:tbl>
-      <w:tblPr>
-        <w:tblStyle w:val="TableGrid"/>
-        <w:tblW w:type="auto" w:w="0"/>
-        <w:jc w:val="left"/>
-        <w:tblLook w:firstColumn="1" w:firstRow="1" w:lastColumn="0" w:lastRow="0" w:noHBand="0" w:noVBand="1" w:val="04A0"/>
-      </w:tblPr>
-      <w:tblGrid>
-        <w:gridCol w:w="2351"/>
-        <w:gridCol w:w="2351"/>
-        <w:gridCol w:w="2351"/>
-        <w:gridCol w:w="2351"/>
-      </w:tblGrid>
-      <w:tr>
-        <w:tc>
-          <w:tcPr>
-            <w:tcW w:type="dxa" w:w="720"/>
-            <w:shd w:val="clear" w:color="auto" w:fill="1e3a5f"/>
-          </w:tcPr>
-          <w:p>
-            <w:pPr>
-              <w:spacing w:after="40"/>
-            </w:pPr>
-            <w:r>
-              <w:rPr>
-                <w:b/>
-                <w:i w:val="0"/>
-                <w:color w:val="FFFFFF"/>
-                <w:sz w:val="18"/>
-              </w:rPr>
-              <w:t>Phase</w:t>
-            </w:r>
-          </w:p>
-        </w:tc>
-        <w:tc>
-          <w:tcPr>
-            <w:tcW w:type="dxa" w:w="5472"/>
-            <w:shd w:val="clear" w:color="auto" w:fill="1e3a5f"/>
-          </w:tcPr>
-          <w:p>
-            <w:pPr>
-              <w:spacing w:after="40"/>
-            </w:pPr>
-            <w:r>
-              <w:rPr>
-                <w:b/>
-                <w:i w:val="0"/>
-                <w:color w:val="FFFFFF"/>
-                <w:sz w:val="18"/>
-              </w:rPr>
-              <w:t>What</w:t>
-            </w:r>
-          </w:p>
-        </w:tc>
-        <w:tc>
-          <w:tcPr>
-            <w:tcW w:type="dxa" w:w="1296"/>
-            <w:shd w:val="clear" w:color="auto" w:fill="1e3a5f"/>
-          </w:tcPr>
-          <w:p>
-            <w:pPr>
-              <w:spacing w:after="40"/>
-            </w:pPr>
-            <w:r>
-              <w:rPr>
-                <w:b/>
-                <w:i w:val="0"/>
-                <w:color w:val="FFFFFF"/>
-                <w:sz w:val="18"/>
-              </w:rPr>
-              <w:t>Effort</w:t>
-            </w:r>
-          </w:p>
-        </w:tc>
-        <w:tc>
-          <w:tcPr>
-            <w:tcW w:type="dxa" w:w="2736"/>
-            <w:shd w:val="clear" w:color="auto" w:fill="1e3a5f"/>
-          </w:tcPr>
-          <w:p>
-            <w:pPr>
-              <w:spacing w:after="40"/>
-            </w:pPr>
-            <w:r>
-              <w:rPr>
-                <w:b/>
-                <w:i w:val="0"/>
-                <w:color w:val="FFFFFF"/>
-                <w:sz w:val="18"/>
-              </w:rPr>
-              <w:t>Gate</w:t>
+              <w:t>Strategy C testing complete; FP &lt; 10%</w:t>
             </w:r>
           </w:p>
         </w:tc>
@@ -7742,7 +8013,7 @@
       <w:tr>
         <w:tc>
           <w:tcPr>
-            <w:tcW w:type="dxa" w:w="720"/>
+            <w:tcW w:type="dxa" w:w="1008"/>
             <w:shd w:val="clear" w:color="auto" w:fill="F8FAFC"/>
           </w:tcPr>
           <w:p>
@@ -7756,13 +8027,13 @@
                 <w:color w:val="0F172A"/>
                 <w:sz w:val="18"/>
               </w:rPr>
-              <w:t>4a</w:t>
-            </w:r>
-          </w:p>
-        </w:tc>
-        <w:tc>
-          <w:tcPr>
-            <w:tcW w:type="dxa" w:w="5472"/>
+              <w:t>LDQ</w:t>
+            </w:r>
+          </w:p>
+        </w:tc>
+        <w:tc>
+          <w:tcPr>
+            <w:tcW w:type="dxa" w:w="5040"/>
             <w:shd w:val="clear" w:color="auto" w:fill="F8FAFC"/>
           </w:tcPr>
           <w:p>
@@ -7776,7 +8047,7 @@
                 <w:color w:val="0F172A"/>
                 <w:sz w:val="18"/>
               </w:rPr>
-              <w:t>In-process operational CBs in trading-agent-c (shadow mode). Per-agent eval after handoff. CircuitBreakerError skeleton.</w:t>
+              <w:t>LLM drift signals: output token trend, model version tracking, tool retry rate</w:t>
             </w:r>
           </w:p>
         </w:tc>
@@ -7796,13 +8067,13 @@
                 <w:color w:val="0F172A"/>
                 <w:sz w:val="18"/>
               </w:rPr>
-              <w:t>1-2 days</w:t>
-            </w:r>
-          </w:p>
-        </w:tc>
-        <w:tc>
-          <w:tcPr>
-            <w:tcW w:type="dxa" w:w="2736"/>
+              <w:t>Planned</w:t>
+            </w:r>
+          </w:p>
+        </w:tc>
+        <w:tc>
+          <w:tcPr>
+            <w:tcW w:type="dxa" w:w="3024"/>
             <w:shd w:val="clear" w:color="auto" w:fill="F8FAFC"/>
           </w:tcPr>
           <w:p>
@@ -7816,7 +8087,7 @@
                 <w:color w:val="0F172A"/>
                 <w:sz w:val="18"/>
               </w:rPr>
-              <w:t>Q4 done; Strategy C in testing</w:t>
+              <w:t>Next sprint</w:t>
             </w:r>
           </w:p>
         </w:tc>
@@ -7824,7 +8095,7 @@
       <w:tr>
         <w:tc>
           <w:tcPr>
-            <w:tcW w:type="dxa" w:w="720"/>
+            <w:tcW w:type="dxa" w:w="1008"/>
             <w:shd w:val="clear" w:color="auto" w:fill="FFFFFF"/>
           </w:tcPr>
           <w:p>
@@ -7838,13 +8109,13 @@
                 <w:color w:val="0F172A"/>
                 <w:sz w:val="18"/>
               </w:rPr>
-              <w:t>4b</w:t>
-            </w:r>
-          </w:p>
-        </w:tc>
-        <w:tc>
-          <w:tcPr>
-            <w:tcW w:type="dxa" w:w="5472"/>
+              <w:t>D2</w:t>
+            </w:r>
+          </w:p>
+        </w:tc>
+        <w:tc>
+          <w:tcPr>
+            <w:tcW w:type="dxa" w:w="5040"/>
             <w:shd w:val="clear" w:color="auto" w:fill="FFFFFF"/>
           </w:tcPr>
           <w:p>
@@ -7858,7 +8129,7 @@
                 <w:color w:val="0F172A"/>
                 <w:sz w:val="18"/>
               </w:rPr>
-              <w:t>Supabase realtime subscription on c_sessions. Auto-run evals + quality judge post-session.</w:t>
+              <w:t>Sequence pattern mining</w:t>
             </w:r>
           </w:p>
         </w:tc>
@@ -7878,13 +8149,13 @@
                 <w:color w:val="0F172A"/>
                 <w:sz w:val="18"/>
               </w:rPr>
-              <w:t>1 day</w:t>
-            </w:r>
-          </w:p>
-        </w:tc>
-        <w:tc>
-          <w:tcPr>
-            <w:tcW w:type="dxa" w:w="2736"/>
+              <w:t>Not started</w:t>
+            </w:r>
+          </w:p>
+        </w:tc>
+        <w:tc>
+          <w:tcPr>
+            <w:tcW w:type="dxa" w:w="3024"/>
             <w:shd w:val="clear" w:color="auto" w:fill="FFFFFF"/>
           </w:tcPr>
           <w:p>
@@ -7898,7 +8169,7 @@
                 <w:color w:val="0F172A"/>
                 <w:sz w:val="18"/>
               </w:rPr>
-              <w:t>4a done</w:t>
+              <w:t>50+ sessions</w:t>
             </w:r>
           </w:p>
         </w:tc>
@@ -7906,7 +8177,7 @@
       <w:tr>
         <w:tc>
           <w:tcPr>
-            <w:tcW w:type="dxa" w:w="720"/>
+            <w:tcW w:type="dxa" w:w="1008"/>
             <w:shd w:val="clear" w:color="auto" w:fill="F8FAFC"/>
           </w:tcPr>
           <w:p>
@@ -7920,13 +8191,13 @@
                 <w:color w:val="0F172A"/>
                 <w:sz w:val="18"/>
               </w:rPr>
-              <w:t>4c</w:t>
-            </w:r>
-          </w:p>
-        </w:tc>
-        <w:tc>
-          <w:tcPr>
-            <w:tcW w:type="dxa" w:w="5472"/>
+              <w:t>P1</w:t>
+            </w:r>
+          </w:p>
+        </w:tc>
+        <w:tc>
+          <w:tcPr>
+            <w:tcW w:type="dxa" w:w="5040"/>
             <w:shd w:val="clear" w:color="auto" w:fill="F8FAFC"/>
           </w:tcPr>
           <w:p>
@@ -7940,7 +8211,7 @@
                 <w:color w:val="0F172A"/>
                 <w:sz w:val="18"/>
               </w:rPr>
-              <w:t>Flip CBs to real mode. Operational first; quality after separate validation.</w:t>
+              <w:t>Predictive early warning: declining score trend → incident probability</w:t>
             </w:r>
           </w:p>
         </w:tc>
@@ -7960,13 +8231,13 @@
                 <w:color w:val="0F172A"/>
                 <w:sz w:val="18"/>
               </w:rPr>
-              <w:t>0.5 days</w:t>
-            </w:r>
-          </w:p>
-        </w:tc>
-        <w:tc>
-          <w:tcPr>
-            <w:tcW w:type="dxa" w:w="2736"/>
+              <w:t>Not started</w:t>
+            </w:r>
+          </w:p>
+        </w:tc>
+        <w:tc>
+          <w:tcPr>
+            <w:tcW w:type="dxa" w:w="3024"/>
             <w:shd w:val="clear" w:color="auto" w:fill="F8FAFC"/>
           </w:tcPr>
           <w:p>
@@ -7980,7 +8251,89 @@
                 <w:color w:val="0F172A"/>
                 <w:sz w:val="18"/>
               </w:rPr>
-              <w:t>Strategy C testing complete; FP &lt; 10%</w:t>
+              <w:t>100+ sessions</w:t>
+            </w:r>
+          </w:p>
+        </w:tc>
+      </w:tr>
+      <w:tr>
+        <w:tc>
+          <w:tcPr>
+            <w:tcW w:type="dxa" w:w="1008"/>
+            <w:shd w:val="clear" w:color="auto" w:fill="FFFFFF"/>
+          </w:tcPr>
+          <w:p>
+            <w:pPr>
+              <w:spacing w:after="40"/>
+            </w:pPr>
+            <w:r>
+              <w:rPr>
+                <w:b w:val="0"/>
+                <w:i w:val="0"/>
+                <w:color w:val="0F172A"/>
+                <w:sz w:val="18"/>
+              </w:rPr>
+              <w:t>9</w:t>
+            </w:r>
+          </w:p>
+        </w:tc>
+        <w:tc>
+          <w:tcPr>
+            <w:tcW w:type="dxa" w:w="5040"/>
+            <w:shd w:val="clear" w:color="auto" w:fill="FFFFFF"/>
+          </w:tcPr>
+          <w:p>
+            <w:pPr>
+              <w:spacing w:after="40"/>
+            </w:pPr>
+            <w:r>
+              <w:rPr>
+                <w:b w:val="0"/>
+                <w:i w:val="0"/>
+                <w:color w:val="0F172A"/>
+                <w:sz w:val="18"/>
+              </w:rPr>
+              <w:t>Multi-tenant: per-customer Isolation Forest, tenant_id schema, hosted auth</w:t>
+            </w:r>
+          </w:p>
+        </w:tc>
+        <w:tc>
+          <w:tcPr>
+            <w:tcW w:type="dxa" w:w="1296"/>
+            <w:shd w:val="clear" w:color="auto" w:fill="FFFFFF"/>
+          </w:tcPr>
+          <w:p>
+            <w:pPr>
+              <w:spacing w:after="40"/>
+            </w:pPr>
+            <w:r>
+              <w:rPr>
+                <w:b w:val="0"/>
+                <w:i w:val="0"/>
+                <w:color w:val="0F172A"/>
+                <w:sz w:val="18"/>
+              </w:rPr>
+              <w:t>Not started</w:t>
+            </w:r>
+          </w:p>
+        </w:tc>
+        <w:tc>
+          <w:tcPr>
+            <w:tcW w:type="dxa" w:w="3024"/>
+            <w:shd w:val="clear" w:color="auto" w:fill="FFFFFF"/>
+          </w:tcPr>
+          <w:p>
+            <w:pPr>
+              <w:spacing w:after="40"/>
+            </w:pPr>
+            <w:r>
+              <w:rPr>
+                <w:b w:val="0"/>
+                <w:i w:val="0"/>
+                <w:color w:val="0F172A"/>
+                <w:sz w:val="18"/>
+              </w:rPr>
+              <w:t>LinkedIn demand test: 3+ engineer DMs</w:t>
             </w:r>
           </w:p>
         </w:tc>

</xml_diff>